<commit_message>
docs: add Chapter 13 Telecom Digital Twin Architecture and update Word project report
</commit_message>
<xml_diff>
--- a/docs/CERAGON_TERAFLOWSDN_TECHNICAL_PROJECT_REPORT.docx
+++ b/docs/CERAGON_TERAFLOWSDN_TECHNICAL_PROJECT_REPORT.docx
@@ -1676,12 +1676,538 @@
           <w:color w:val="1B365D"/>
           <w:sz w:val="36"/>
         </w:rPr>
-        <w:t>9. Conclusion &amp; Technology Roadmap Towards 6G</w:t>
+        <w:t>9. Telecom Network Digital Twin (NDT) &amp; Multi-Layer API Framework</w:t>
       </w:r>
     </w:p>
     <w:p>
       <w:r>
-        <w:t>This project successfully bridges the long-standing divide between proprietary carrier wireless transport hardware and open-source cloud-native SDN orchestration. By delivering native RFC 8040 RESTCONF candidate datastore drivers, extracting 51 production YANG schemas, replicating a 34-node O-RAN transport network, and providing standard Northbound REST interfaces, the platform establishes an open, production-grade foundation for autonomous wireless transport.</w:t>
+        <w:t>To achieve autonomous, predictive, and zero-touch operations for 6G transport networks, the system implements a standardized Telecom Network Digital Twin (NDT) framework. Rather than acting as a static simulator, the digital twin serves as a dynamic, synchronized runtime engine that evaluates what-if perturbations, predicts bit error rate and throughput degradation prior to SLA boundary violations, and closes the optimization loop back to physical Ceragon transport elements.</w:t>
+      </w:r>
+    </w:p>
+    <w:p>
+      <w:pPr>
+        <w:keepNext/>
+        <w:spacing w:before="280" w:after="80"/>
+      </w:pPr>
+      <w:r>
+        <w:rPr>
+          <w:rFonts w:ascii="Calibri" w:hAnsi="Calibri"/>
+          <w:b/>
+          <w:color w:val="2980B9"/>
+          <w:sz w:val="28"/>
+        </w:rPr>
+        <w:t>9.1 Standardization Anchors</w:t>
+      </w:r>
+    </w:p>
+    <w:p>
+      <w:r>
+        <w:t>The digital twin architecture is directly anchored on the emerging global telecommunications standards:</w:t>
+        <w:br/>
+        <w:t>• 3GPP TS 28.561 (Release 19 SA5): Management aspects of Network Digital Twins; formalizing the Network Digital Twin Instance (NDTI) lifecycle, data exposure, and experiment execution.</w:t>
+        <w:br/>
+        <w:t>• 3GPP TR 28.915: Foundational study defining architectural use cases, requirements, and mappings to 3GPP Management Services (MnS).</w:t>
+        <w:br/>
+        <w:t>• ITU-T Y.3090: Digital Twin Network (DTN) reference architecture, specifying four discrete functional layers (Physical, Twin Data, Twin Model, Network Application) with open northbound and southbound interfaces.</w:t>
+        <w:br/>
+        <w:t>• IETF/IRTF NMRG (draft-irtf-nmrg-network-digital-twin-arch &amp; draft-paillisse-nmrg-performance-digital-twin-02): Formalizing the Digital Twin Interface (DTI) for scenario simulation requests and performance prediction.</w:t>
+        <w:br/>
+        <w:t>• IETF/IRTF NMRG (draft-zcz-nmrg-digitaltwin-data-collection): Standardizing data collection bindings (NETCONF, RESTCONF, gNMI, YANG push).</w:t>
+        <w:br/>
+        <w:t>• TM Forum ODA (Open Digital Architecture): Open APIs including TMF921 (Intent Management), TMF639 (Resource Inventory), TMF640 (Service Activation), TMF642 (Alarm Management), and TMF645 (Service Qualification).</w:t>
+        <w:br/>
+        <w:t>• 3GPP TS 29.222 / ETSI OpenCAPIF: Common API Framework (CAPIF) providing standardized API discovery, publishing, OAuth 2.0 / mTLS security, and governance across all digital twin services.</w:t>
+      </w:r>
+    </w:p>
+    <w:p>
+      <w:pPr>
+        <w:keepNext/>
+        <w:spacing w:before="280" w:after="80"/>
+      </w:pPr>
+      <w:r>
+        <w:rPr>
+          <w:rFonts w:ascii="Calibri" w:hAnsi="Calibri"/>
+          <w:b/>
+          <w:color w:val="2980B9"/>
+          <w:sz w:val="28"/>
+        </w:rPr>
+        <w:t>9.2 The Five-Layer Telecom Digital Twin API Taxonomy</w:t>
+      </w:r>
+    </w:p>
+    <w:p>
+      <w:r>
+        <w:t>A critical finding of this research is that a production telecom digital twin cannot treat device management APIs and digital twin APIs as identical. The architecture establishes a clear separation of concerns across five discrete API layers:</w:t>
+      </w:r>
+    </w:p>
+    <w:tbl>
+      <w:tblPr>
+        <w:tblW w:type="auto" w:w="0"/>
+        <w:jc w:val="center"/>
+        <w:tblLook w:firstColumn="1" w:firstRow="1" w:lastColumn="0" w:lastRow="0" w:noHBand="0" w:noVBand="1" w:val="04A0"/>
+        <w:tblBorders>
+          <w:top w:val="single" w:sz="4" w:space="0" w:color="D3D3D3"/>
+          <w:bottom w:val="single" w:sz="4" w:space="0" w:color="D3D3D3"/>
+          <w:insideH w:val="single" w:sz="4" w:space="0" w:color="D3D3D3"/>
+          <w:insideV w:val="none"/>
+          <w:left w:val="none"/>
+          <w:right w:val="none"/>
+        </w:tblBorders>
+      </w:tblPr>
+      <w:tblGrid>
+        <w:gridCol w:w="3120"/>
+        <w:gridCol w:w="3120"/>
+        <w:gridCol w:w="3120"/>
+      </w:tblGrid>
+      <w:tr>
+        <w:tc>
+          <w:tcPr>
+            <w:tcW w:type="dxa" w:w="3120"/>
+            <w:shd w:fill="1B365D"/>
+            <w:tcMar>
+              <w:top w:w="120" w:type="dxa"/>
+              <w:bottom w:w="120" w:type="dxa"/>
+              <w:left w:w="160" w:type="dxa"/>
+              <w:right w:w="160" w:type="dxa"/>
+            </w:tcMar>
+          </w:tcPr>
+          <w:p>
+            <w:r>
+              <w:rPr>
+                <w:b/>
+                <w:color w:val="FFFFFF"/>
+                <w:sz w:val="19"/>
+              </w:rPr>
+              <w:t>API Layer</w:t>
+            </w:r>
+          </w:p>
+        </w:tc>
+        <w:tc>
+          <w:tcPr>
+            <w:tcW w:type="dxa" w:w="3120"/>
+            <w:shd w:fill="1B365D"/>
+            <w:tcMar>
+              <w:top w:w="120" w:type="dxa"/>
+              <w:bottom w:w="120" w:type="dxa"/>
+              <w:left w:w="160" w:type="dxa"/>
+              <w:right w:w="160" w:type="dxa"/>
+            </w:tcMar>
+          </w:tcPr>
+          <w:p>
+            <w:r>
+              <w:rPr>
+                <w:b/>
+                <w:color w:val="FFFFFF"/>
+                <w:sz w:val="19"/>
+              </w:rPr>
+              <w:t>Standard Protocols &amp; Bindings</w:t>
+            </w:r>
+          </w:p>
+        </w:tc>
+        <w:tc>
+          <w:tcPr>
+            <w:tcW w:type="dxa" w:w="3120"/>
+            <w:shd w:fill="1B365D"/>
+            <w:tcMar>
+              <w:top w:w="120" w:type="dxa"/>
+              <w:bottom w:w="120" w:type="dxa"/>
+              <w:left w:w="160" w:type="dxa"/>
+              <w:right w:w="160" w:type="dxa"/>
+            </w:tcMar>
+          </w:tcPr>
+          <w:p>
+            <w:r>
+              <w:rPr>
+                <w:b/>
+                <w:color w:val="FFFFFF"/>
+                <w:sz w:val="19"/>
+              </w:rPr>
+              <w:t>Functional Scope &amp; Responsibility</w:t>
+            </w:r>
+          </w:p>
+        </w:tc>
+      </w:tr>
+      <w:tr>
+        <w:tc>
+          <w:tcPr>
+            <w:tcW w:type="dxa" w:w="3120"/>
+            <w:tcMar>
+              <w:top w:w="90" w:type="dxa"/>
+              <w:bottom w:w="90" w:type="dxa"/>
+              <w:left w:w="140" w:type="dxa"/>
+              <w:right w:w="140" w:type="dxa"/>
+            </w:tcMar>
+          </w:tcPr>
+          <w:p>
+            <w:r>
+              <w:rPr>
+                <w:sz w:val="17"/>
+              </w:rPr>
+              <w:t>Layer 1: Southbound Synchronization</w:t>
+            </w:r>
+          </w:p>
+        </w:tc>
+        <w:tc>
+          <w:tcPr>
+            <w:tcW w:type="dxa" w:w="3120"/>
+            <w:tcMar>
+              <w:top w:w="90" w:type="dxa"/>
+              <w:bottom w:w="90" w:type="dxa"/>
+              <w:left w:w="140" w:type="dxa"/>
+              <w:right w:w="140" w:type="dxa"/>
+            </w:tcMar>
+          </w:tcPr>
+          <w:p>
+            <w:r>
+              <w:rPr>
+                <w:sz w:val="17"/>
+              </w:rPr>
+              <w:t>RESTCONF, NETCONF, gNMI, YANG Push (RFC 8641), IPFIX</w:t>
+            </w:r>
+          </w:p>
+        </w:tc>
+        <w:tc>
+          <w:tcPr>
+            <w:tcW w:type="dxa" w:w="3120"/>
+            <w:tcMar>
+              <w:top w:w="90" w:type="dxa"/>
+              <w:bottom w:w="90" w:type="dxa"/>
+              <w:left w:w="140" w:type="dxa"/>
+              <w:right w:w="140" w:type="dxa"/>
+            </w:tcMar>
+          </w:tcPr>
+          <w:p>
+            <w:r>
+              <w:rPr>
+                <w:sz w:val="17"/>
+              </w:rPr>
+              <w:t>Continuously feeds live physical Ceragon radio metrics (RSSI, SNR, MCS, carrier frequency, modem temperature, transmit power) into the twin shadow datastore.</w:t>
+            </w:r>
+          </w:p>
+        </w:tc>
+      </w:tr>
+      <w:tr>
+        <w:tc>
+          <w:tcPr>
+            <w:tcW w:type="dxa" w:w="3120"/>
+            <w:tcMar>
+              <w:top w:w="90" w:type="dxa"/>
+              <w:bottom w:w="90" w:type="dxa"/>
+              <w:left w:w="140" w:type="dxa"/>
+              <w:right w:w="140" w:type="dxa"/>
+            </w:tcMar>
+            <w:shd w:fill="F4F6F9"/>
+          </w:tcPr>
+          <w:p>
+            <w:r>
+              <w:rPr>
+                <w:sz w:val="17"/>
+              </w:rPr>
+              <w:t>Layer 2: Digital Twin Interface (DTI)</w:t>
+            </w:r>
+          </w:p>
+        </w:tc>
+        <w:tc>
+          <w:tcPr>
+            <w:tcW w:type="dxa" w:w="3120"/>
+            <w:tcMar>
+              <w:top w:w="90" w:type="dxa"/>
+              <w:bottom w:w="90" w:type="dxa"/>
+              <w:left w:w="140" w:type="dxa"/>
+              <w:right w:w="140" w:type="dxa"/>
+            </w:tcMar>
+            <w:shd w:fill="F4F6F9"/>
+          </w:tcPr>
+          <w:p>
+            <w:r>
+              <w:rPr>
+                <w:sz w:val="17"/>
+              </w:rPr>
+              <w:t>HTTP/REST, gRPC, NS-3 Discrete-Event C++ IPC</w:t>
+            </w:r>
+          </w:p>
+        </w:tc>
+        <w:tc>
+          <w:tcPr>
+            <w:tcW w:type="dxa" w:w="3120"/>
+            <w:tcMar>
+              <w:top w:w="90" w:type="dxa"/>
+              <w:bottom w:w="90" w:type="dxa"/>
+              <w:left w:w="140" w:type="dxa"/>
+              <w:right w:w="140" w:type="dxa"/>
+            </w:tcMar>
+            <w:shd w:fill="F4F6F9"/>
+          </w:tcPr>
+          <w:p>
+            <w:r>
+              <w:rPr>
+                <w:sz w:val="17"/>
+              </w:rPr>
+              <w:t>Evaluates what-if scenario requests (e.g. 50 mm/hr ITU-R P.838 rain fade, traffic surges) and outputs predicted throughput, latency, loss, and SLA breach warnings.</w:t>
+            </w:r>
+          </w:p>
+        </w:tc>
+      </w:tr>
+      <w:tr>
+        <w:tc>
+          <w:tcPr>
+            <w:tcW w:type="dxa" w:w="3120"/>
+            <w:tcMar>
+              <w:top w:w="90" w:type="dxa"/>
+              <w:bottom w:w="90" w:type="dxa"/>
+              <w:left w:w="140" w:type="dxa"/>
+              <w:right w:w="140" w:type="dxa"/>
+            </w:tcMar>
+          </w:tcPr>
+          <w:p>
+            <w:r>
+              <w:rPr>
+                <w:sz w:val="17"/>
+              </w:rPr>
+              <w:t>Layer 3: Closed-Loop Network Actuation</w:t>
+            </w:r>
+          </w:p>
+        </w:tc>
+        <w:tc>
+          <w:tcPr>
+            <w:tcW w:type="dxa" w:w="3120"/>
+            <w:tcMar>
+              <w:top w:w="90" w:type="dxa"/>
+              <w:bottom w:w="90" w:type="dxa"/>
+              <w:left w:w="140" w:type="dxa"/>
+              <w:right w:w="140" w:type="dxa"/>
+            </w:tcMar>
+          </w:tcPr>
+          <w:p>
+            <w:r>
+              <w:rPr>
+                <w:sz w:val="17"/>
+              </w:rPr>
+              <w:t>ETSI TeraFlowSDN REST NBI, 2PC Candidate Datastore</w:t>
+            </w:r>
+          </w:p>
+        </w:tc>
+        <w:tc>
+          <w:tcPr>
+            <w:tcW w:type="dxa" w:w="3120"/>
+            <w:tcMar>
+              <w:top w:w="90" w:type="dxa"/>
+              <w:bottom w:w="90" w:type="dxa"/>
+              <w:left w:w="140" w:type="dxa"/>
+              <w:right w:w="140" w:type="dxa"/>
+            </w:tcMar>
+          </w:tcPr>
+          <w:p>
+            <w:r>
+              <w:rPr>
+                <w:sz w:val="17"/>
+              </w:rPr>
+              <w:t>Performs pre-commit safety boundary verification in the twin sandbox, then dispatches configuration rules to physical hardware via TFS 2-phase commit.</w:t>
+            </w:r>
+          </w:p>
+        </w:tc>
+      </w:tr>
+      <w:tr>
+        <w:tc>
+          <w:tcPr>
+            <w:tcW w:type="dxa" w:w="3120"/>
+            <w:tcMar>
+              <w:top w:w="90" w:type="dxa"/>
+              <w:bottom w:w="90" w:type="dxa"/>
+              <w:left w:w="140" w:type="dxa"/>
+              <w:right w:w="140" w:type="dxa"/>
+            </w:tcMar>
+            <w:shd w:fill="F4F6F9"/>
+          </w:tcPr>
+          <w:p>
+            <w:r>
+              <w:rPr>
+                <w:sz w:val="17"/>
+              </w:rPr>
+              <w:t>Layer 4: Northbound Intent &amp; Inventory</w:t>
+            </w:r>
+          </w:p>
+        </w:tc>
+        <w:tc>
+          <w:tcPr>
+            <w:tcW w:type="dxa" w:w="3120"/>
+            <w:tcMar>
+              <w:top w:w="90" w:type="dxa"/>
+              <w:bottom w:w="90" w:type="dxa"/>
+              <w:left w:w="140" w:type="dxa"/>
+              <w:right w:w="140" w:type="dxa"/>
+            </w:tcMar>
+            <w:shd w:fill="F4F6F9"/>
+          </w:tcPr>
+          <w:p>
+            <w:r>
+              <w:rPr>
+                <w:sz w:val="17"/>
+              </w:rPr>
+              <w:t>TM Forum TMF921 (Intent), TMF639 (Resource Inventory)</w:t>
+            </w:r>
+          </w:p>
+        </w:tc>
+        <w:tc>
+          <w:tcPr>
+            <w:tcW w:type="dxa" w:w="3120"/>
+            <w:tcMar>
+              <w:top w:w="90" w:type="dxa"/>
+              <w:bottom w:w="90" w:type="dxa"/>
+              <w:left w:w="140" w:type="dxa"/>
+              <w:right w:w="140" w:type="dxa"/>
+            </w:tcMar>
+            <w:shd w:fill="F4F6F9"/>
+          </w:tcPr>
+          <w:p>
+            <w:r>
+              <w:rPr>
+                <w:sz w:val="17"/>
+              </w:rPr>
+              <w:t>Exposes high-level declarative intent contracts and standardized physical resource inventories to orchestrators, BSS, and cognitive AI/RL agents.</w:t>
+            </w:r>
+          </w:p>
+        </w:tc>
+      </w:tr>
+      <w:tr>
+        <w:tc>
+          <w:tcPr>
+            <w:tcW w:type="dxa" w:w="3120"/>
+            <w:tcMar>
+              <w:top w:w="90" w:type="dxa"/>
+              <w:bottom w:w="90" w:type="dxa"/>
+              <w:left w:w="140" w:type="dxa"/>
+              <w:right w:w="140" w:type="dxa"/>
+            </w:tcMar>
+          </w:tcPr>
+          <w:p>
+            <w:r>
+              <w:rPr>
+                <w:sz w:val="17"/>
+              </w:rPr>
+              <w:t>Layer 5: API Exposure &amp; Governance</w:t>
+            </w:r>
+          </w:p>
+        </w:tc>
+        <w:tc>
+          <w:tcPr>
+            <w:tcW w:type="dxa" w:w="3120"/>
+            <w:tcMar>
+              <w:top w:w="90" w:type="dxa"/>
+              <w:bottom w:w="90" w:type="dxa"/>
+              <w:left w:w="140" w:type="dxa"/>
+              <w:right w:w="140" w:type="dxa"/>
+            </w:tcMar>
+          </w:tcPr>
+          <w:p>
+            <w:r>
+              <w:rPr>
+                <w:sz w:val="17"/>
+              </w:rPr>
+              <w:t>3GPP CAPIF (TS 29.222) / ETSI OpenCAPIF</w:t>
+            </w:r>
+          </w:p>
+        </w:tc>
+        <w:tc>
+          <w:tcPr>
+            <w:tcW w:type="dxa" w:w="3120"/>
+            <w:tcMar>
+              <w:top w:w="90" w:type="dxa"/>
+              <w:bottom w:w="90" w:type="dxa"/>
+              <w:left w:w="140" w:type="dxa"/>
+              <w:right w:w="140" w:type="dxa"/>
+            </w:tcMar>
+          </w:tcPr>
+          <w:p>
+            <w:r>
+              <w:rPr>
+                <w:sz w:val="17"/>
+              </w:rPr>
+              <w:t>Governs API publishing, catalog discovery, OAuth 2.0 / mTLS security, rate limiting, and invocation auditing across the digital twin ecosystem.</w:t>
+            </w:r>
+          </w:p>
+        </w:tc>
+      </w:tr>
+    </w:tbl>
+    <w:p/>
+    <w:p>
+      <w:pPr>
+        <w:keepNext/>
+        <w:spacing w:before="280" w:after="80"/>
+      </w:pPr>
+      <w:r>
+        <w:rPr>
+          <w:rFonts w:ascii="Calibri" w:hAnsi="Calibri"/>
+          <w:b/>
+          <w:color w:val="2980B9"/>
+          <w:sz w:val="28"/>
+        </w:rPr>
+        <w:t>9.3 3GPP TS 28.561 NDTI Instance Lifecycle State Machine</w:t>
+      </w:r>
+    </w:p>
+    <w:p>
+      <w:r>
+        <w:t>Network Digital Twin Instances (NDTI) are governed by a formal state machine managed by the Network Digital Twin Management Function (NDTMF):</w:t>
+        <w:br/>
+        <w:t>1. NULL -&gt; INITIALIZING: Triggered by 'CreateNDTI', instantiating shadow topology structures.</w:t>
+        <w:br/>
+        <w:t>2. INITIALIZING -&gt; SYNCHRONIZED: Triggered by 'InitializeNDTI', populating node inventory and baseline RF parameters from TFS.</w:t>
+        <w:br/>
+        <w:t>3. SYNCHRONIZED -&gt; UPDATING: Periodic or event-driven 'SyncNDTI' execution reconciling live measurements with the twin datastore.</w:t>
+        <w:br/>
+        <w:t>4. SYNCHRONIZED -&gt; EXECUTING_EXPERIMENT: Processing what-if scenario perturbations through NS-3 or analytical physics engines.</w:t>
+        <w:br/>
+        <w:t>5. EXECUTING_EXPERIMENT -&gt; SYNCHRONIZED: Returning results via 'RetrieveResults' and restoring baseline shadow state.</w:t>
+        <w:br/>
+        <w:t>6. ANY -&gt; TERMINATED: Gracefully deallocating resources via 'TerminateNDTI'.</w:t>
+      </w:r>
+    </w:p>
+    <w:p>
+      <w:pPr>
+        <w:keepNext/>
+        <w:spacing w:before="280" w:after="80"/>
+      </w:pPr>
+      <w:r>
+        <w:rPr>
+          <w:rFonts w:ascii="Calibri" w:hAnsi="Calibri"/>
+          <w:b/>
+          <w:color w:val="2980B9"/>
+          <w:sz w:val="28"/>
+        </w:rPr>
+        <w:t>9.4 End-to-End Verification of the Closed-Loop Digital Twin</w:t>
+      </w:r>
+    </w:p>
+    <w:p>
+      <w:r>
+        <w:t>The digital twin framework was implemented in 'tfs-unity' ('tfs_digital_twin_api.py') and verified end-to-end via 'demo_telecom_digital_twin.py':</w:t>
+        <w:br/>
+        <w:t>• CAPIF Service Discovery: Successfully published and discovered 'TelecomDigitalTwin_DTI_API' conforming to 3GPP TS 29.222.</w:t>
+        <w:br/>
+        <w:t>• 3GPP NDTI Instantiation: Created instance 'ndti-oran-transport-demo' and synchronized 34 transport nodes and links from TFS.</w:t>
+        <w:br/>
+        <w:t>• TM Forum TMF921 Ingestion: Ingested declarative intent specifying maximum latency &lt; 1.5ms and availability &gt; 99.999%.</w:t>
+        <w:br/>
+        <w:t>• DTI What-If Scenario Execution: Injected a 55.0 mm/hr heavy rain perturbation on Ceragon link 'ctu-96'. The twin computed 19.93 dB attenuation under ITU-R P.838, predicted SNR collapse to 4.07 dB, modulation drop to MCS 0, and flagged an imminent SLA breach.</w:t>
+        <w:br/>
+        <w:t>• Closed-Loop Actuation: Digital twin evaluated candidate mitigation against RF safety constraints (frequency band 57–71 GHz, minimum MCS 2), then committed configuration rules (/radio/tuning to 64.8 GHz, /modulation/acm_floor to MCS 2, and URLLC slice reservation) through ETSI TeraFlowSDN's 2-Phase Commit engine down to physical hardware.</w:t>
+      </w:r>
+    </w:p>
+    <w:p>
+      <w:pPr>
+        <w:keepNext/>
+        <w:spacing w:before="360" w:after="120"/>
+      </w:pPr>
+      <w:r>
+        <w:rPr>
+          <w:rFonts w:ascii="Calibri" w:hAnsi="Calibri"/>
+          <w:b/>
+          <w:color w:val="1B365D"/>
+          <w:sz w:val="36"/>
+        </w:rPr>
+        <w:t>10. Conclusion &amp; Technology Roadmap Towards 6G</w:t>
+      </w:r>
+    </w:p>
+    <w:p>
+      <w:r>
+        <w:t>This project successfully bridges the long-standing divide between proprietary carrier wireless transport hardware, open-source cloud-native SDN orchestration, and emerging telecom digital twin standards. By delivering native RFC 8040 RESTCONF candidate datastore drivers, extracting 51 production YANG schemas, replicating a 34-node O-RAN transport network, implementing the IETF NMRG Digital Twin Interface (DTI), and aligning with 3GPP TS 28.561 and TM Forum Open APIs, the platform establishes an open, production-grade foundation for autonomous wireless transport.</w:t>
       </w:r>
     </w:p>
     <w:p>

</xml_diff>